<commit_message>
Paella EN: ronda de la revisión final regenerada (4 entregables), gates G1-G9 VERDE, F2-NOTAS §9 y sha256 de §8
Sin cifras del caso, precios, costes ni ejemplos distintos; solo eventos_a2/_a3 redondeados (149 / 157). Regresión de los
7 planes en verde; sha256 Mac = VPS.

Co-Authored-By: Claude Opus 5.5 <noreply@anthropic.com>
Claude-Session: https://claude.ai/code/session_01LzWqvTU1jPmLwXsDXHDGWJ
Via: Claude Code
</commit_message>
<xml_diff>
--- a/astro-site/public/dl/paella-catering-business-plan/paella-catering-business-plan.docx
+++ b/astro-site/public/dl/paella-catering-business-plan/paella-catering-business-plan.docx
@@ -320,22 +320,22 @@
     </w:p>
     <w:p>
       <w:r>
-        <w:t>The concept is a live paella caterer. The paella is cooked in front of the guests, in pans of 26 to 36 in (65 to 90 cm) over 3-ring propane burners, and served with a salad and bread. That cooking is the product, not an extra: guests watch the sofrito go in, the stock go on and the socarrat form. The sofrito, the stock, the cut vegetables and the cleaned seafood come out of the commissary the day before, so at the event we only cook and serve. Drop-off paella, cooked in the commissary and delivered hot, is the smaller second line, and a seafood and tapas premium is the third. Gas is the base; wood only where a permit allows it, and induction indoors. We are not a paella food truck or a restaurant.</w:t>
+        <w:t>The concept is a live paella caterer. The paella is cooked in front of the guests, in pans of 26 to 36 in (65 to 90 cm) over 3-ring propane burners, and served with a salad and bread. That cooking is the product, not an extra: guests watch the sofrito go in, the stock go on and the socarrat form. The sofrito, the stock, the cut vegetables and the cleaned seafood come out of the commissary the day before, so at the event we only cook and serve. Drop-off paella, cooked in the commissary and delivered hot, is the smaller second line, and a seafood and tapas premium is the third. Gas is the base; wood only where a permit allows it, and for indoor venues, induction burners with smaller pans, rented or bought separately (they are not in the example budget). We are not a paella food truck or a restaurant.</w:t>
       </w:r>
     </w:p>
     <w:p>
       <w:r>
-        <w:t>The total startup investment is $88,966: $49,480 in startup costs plus $39,486 of working capital. The heaviest lines are the used cargo van ($18,000), the paella pans ($1,800), the burners and stands ($2,500) and the launch budget ($4,500). Notice how small the cooking gear is next to the van. We do not build or lease a restaurant, which keeps the investment well below a venue with its own dining room and kitchen. We cover it with $25,000 of owner equity (28% of the total) and a $64,000 loan at 10.0% over 7 years. A loan of that size does not fit the $50,000 SBA Microloan cap, so the realistic routes are a bank loan or an SBA 7(a) loan, and no plan can promise a lender's answer.</w:t>
+        <w:t>The total startup investment is $88,966: $49,480 in startup costs plus $39,486 of working capital. The heaviest lines are the used cargo van ($18,000), the launch budget ($4,500), the van upfit ($3,000), the event setup ($3,000) and the burners and stands ($2,500); the paella pans cost only $1,800. Notice how small the cooking gear is next to the van. We do not build or lease a restaurant, which keeps the investment well below a venue with its own dining room and kitchen. We cover it with $25,000 of owner equity (28% of the total) and a $64,000 loan at 10.0% over 7 years. A loan of that size does not fit the $50,000 SBA Microloan cap, so the realistic routes are a bank loan or an SBA 7(a) loan, and no plan can promise a lender's answer.</w:t>
       </w:r>
     </w:p>
     <w:p>
       <w:r>
-        <w:t>In year 1 we plan 135 events with an average of 58 guests at $40.00 per guest, excluding sales tax. That adds up to $313,200 in revenue, growing to $344,520 in year 2 and $365,191 in year 3 as events rise to 148 and 157. Year-1 EBITDA is 12.5% of sales, the lowest debt service coverage is 2.47×, and the business breaks even at 116 events a year. Be honest about what this case is: a full-time owner who is also the paella chef, with a second cook on weekends, not the average first year. A new operator more often lands near $225,000 in sales in year 1 (a kit estimate), so read these numbers as a well-run target and change the inputs to your own.</w:t>
+        <w:t>In year 1 we plan 135 events with an average of 58 guests at $40.00 per guest, excluding sales tax. That adds up to $313,200 in revenue, growing to $344,520 in year 2 and $365,191 in year 3 as events grow by 10% and then 6% (about 149 and 157 a year). Year-1 EBITDA is 12.5% of sales, the lowest debt service coverage is 2.47×, and the business breaks even at 116 events a year. Be honest about what this case is: a full-time owner who is also the paella chef, with a second cook on weekends, not the average first year. A new operator more often lands near $225,000 in sales in year 1 (a kit estimate), so read these numbers as a well-run target and change the inputs to your own.</w:t>
       </w:r>
     </w:p>
     <w:p>
       <w:r>
-        <w:t>The founding team is small. The owner is the paella chef, who also sells and buys. A lead cook, who doubles as the second paella chef, covers the second pan line on busy weekends, event staff (servers and buffet attendants) work event by event, and a prep cook doubles as the van driver. Everyone except the owner is a part-time hourly W-2 employee. That makes 7 people, or 2.10 full-time equivalents. Replace this paragraph with your own background: a lender wants to see who has run a rice kitchen and who has sold events. The plan shows that a paella caterer can start without a restaurant and with controlled risk, as long as every event is quoted, deposited and staffed on purpose.</w:t>
+        <w:t>The founding team is small. The owner is the paella chef, who also sells and buys. A lead cook, who doubles as the second paella chef, runs the second set of pans on busy weekends, event staff (servers and buffet attendants) work event by event, and a prep cook doubles as the van driver. Everyone except the owner is a part-time hourly W-2 employee. That makes 7 people, or 2.10 full-time equivalents. Replace this paragraph with your own background: a lender wants to see who has run a rice kitchen and who has sold events. The plan shows that a paella caterer can start without a restaurant and with controlled risk, as long as every event is quoted, deposited and staffed on purpose.</w:t>
       </w:r>
     </w:p>
     <w:p>
@@ -367,7 +367,7 @@
     </w:p>
     <w:p>
       <w:r>
-        <w:t>We quote by the guest, excluding sales tax and with the paella chef, the staff and the service charge included, and the average is $40.00. With 58 guests per event, the average event brings in $2,320. Paella packages are 88% of sales, and the rest are add-ons such as a tapas hour, desserts, non-alcoholic sangria and drinks, rentals, extra hours and travel fees. A guest minimum protects small events (the operators we read ask for 20 to 30 guests), and a deposit blocks the date: most US caterers ask for 25% to 50% (a kit estimate), and the pricing calculator proposes 50%. The service charge is part of our price. A voluntary gratuity is not, and it belongs to the staff.</w:t>
+        <w:t>We quote by the guest, excluding sales tax and with the paella chef, the staff and the service charge included, and the average is $40.00. With 58 guests per event, the average event brings in $2,320. Paella packages are 88% of sales, and the rest are add-ons such as a tapas hour, desserts, non-alcoholic sangria and drinks, rentals, extra hours and travel fees. A guest minimum protects small events (the operators we read ask for 20 to 30 guests), and a deposit holds the date: most US caterers ask for 25% to 50% (a kit estimate), and the pricing calculator proposes 50%. The service charge is part of our price. A voluntary gratuity is not, and it belongs to the staff.</w:t>
       </w:r>
     </w:p>
     <w:p>
@@ -414,7 +414,7 @@
     </w:p>
     <w:p>
       <w:r>
-        <w:t>The example mix is a kit estimate, not market data. Of 135 events, 25 are corporate drop-offs (30 guests at $22), 60 are backyard paella parties (45 guests at $34), 25 are company events (75 guests at $38), 18 are weddings and rehearsal dinners (110 guests at $52) and 7 are seafood and tapas premium events (70 guests at $65). Weddings are 13% of the events and 33% of the sales. The calendar is uneven too. The example opens in March, so Month 1 is March, with the peaks in May, June and October and the weakest months in January and February. The lowest cash balance falls in Month 2 at $31,627. Rotate the curve to your opening month and replace the shares with what your bookings show.</w:t>
+        <w:t>The example mix is a kit estimate, not market data. Of 135 events, 25 are corporate drop-offs (30 guests at $22), 60 are backyard paella parties (45 guests at $34), 25 are company events (75 guests at $38), 18 are weddings and rehearsal dinners (110 guests at $52) and 7 are seafood and tapas premium events (70 guests at $65). Weddings are 13% of the events and 33% of the sales. The calendar is uneven too. The example opens in March, so Month 1 is March, with the peaks in May, June and October and the weakest months in January and February. The lowest cash balance falls in Month 2 at $31,627. Rotate the curve to your opening month and replace the shares with what your bookings show. In Florida, where the peak runs from winter into spring, move share from July and August into January to April.</w:t>
       </w:r>
     </w:p>
     <w:p>
@@ -493,7 +493,7 @@
     </w:p>
     <w:p>
       <w:r>
-        <w:t>The marketing strategy follows two funnels, plus one channel that runs on referrals. Weddings and rehearsal dinners have a long cycle: the client finds you online, asks for a quote, attends a tasting and signs months before the date. Companies have a short, repeating cycle: a well-run team lunch leads to the next order and to a referral inside the same office. Backyard paella parties travel by word of mouth, so treat each funnel with its own message and channel. Rest all of them on the same promise: paella cooked live that arrives at its best, a paella chef the guests can see and a contract that gives peace of mind.</w:t>
+        <w:t>The marketing strategy follows two funnels, plus one channel that runs on referrals. Weddings and rehearsal dinners have a long cycle: the client finds you online, asks for a quote, attends a tasting and signs months before the date. Companies have a short, repeating cycle: a well-run team lunch leads to the next order and to a referral inside the same office. Backyard paella parties travel by word of mouth, so treat each funnel with its own message and channel. Build all three on the same promise: paella cooked live that arrives at its best, a paella chef the guests can see and a contract that gives peace of mind.</w:t>
       </w:r>
     </w:p>
     <w:p>
@@ -550,12 +550,12 @@
     </w:p>
     <w:p>
       <w:r>
-        <w:t>The equipment list follows the order in which the food moves, so we buy in that order too. First, what cooks: the paella burners and stands ($2,500), the pans ($1,800) and the propane and fire-safety kit ($900). Size each pan by how many guests it feeds: as a Kit estimate, a 36 in (90 cm) pan serves about 40 guests, a 32 in (80 cm) pan about 30 and a 26 in (65 cm) pan about 18. Second, what protects: the canopy over the cooking station, the extinguishers and the fire blanket. Third, what holds and serves: tables, a handwashing station, coolers, chafing dishes and insulated carriers, all in the event setup and holding line ($3,000). The used cargo van ($18,000) and its upfit with upright racks for the cylinders ($3,000) come with the plan, so nothing in it depends on a vehicle you may already own.</w:t>
+        <w:t>The equipment list follows the order in which the food moves, so we buy in that order too. First, what cooks: the paella burners and stands ($2,500), the pans ($1,800) and the propane and fire-safety kit ($900). Size each pan by how many guests it feeds: as a kit estimate, a 36 in (90 cm) pan serves about 40 guests, a 32 in (80 cm) pan about 30 and a 26 in (65 cm) pan about 18. Second, what protects: the canopy over the cooking station, the extinguishers and the fire blanket. Third, what holds and serves: tables, a handwashing station, coolers, chafing dishes and insulated carriers, all in the event setup and holding line ($3,000). The used cargo van ($18,000) and its upfit with upright racks for the cylinders ($3,000) come with the plan, so nothing in it depends on a vehicle you may already own.</w:t>
       </w:r>
     </w:p>
     <w:p>
       <w:r>
-        <w:t>Every event follows the same phases, from the quote to the final payment. About three weeks out we hold the briefing with the client to confirm the menu style, the guest count, the timeline and the allergies. About two weeks out we visit the venue to choose where the cooking station goes, away from the guest tent, and to check water, power and van access. One to two days ahead we order the seafood and keep its tags. The day before, in the commissary, we make the sofrito and the stock and clean the seafood, and we label everything. On the day we arrive two to three hours early, set up the cooking station, light the burners and cook for about an hour; service runs about two hours and breakdown about one, according to Miami Grill Catering's published timeline. Plan one team member for every 25 guests. Afterward we clean and oil the pans, close the cylinders and send the final invoice with any add-ons. Write the times down for every event: that log is your best defense if a guest ever complains.</w:t>
+        <w:t>Every event follows the same phases, from the quote to the final payment. About three weeks out we hold the final planning call with the client to confirm the menu style, the guest count, the timeline and the allergies. About two weeks out we visit the venue to choose where the cooking station goes, away from the guest tent, and to check water, power and van access. One to two days ahead we order the seafood and keep its tags. The day before, in the commissary, we make the sofrito and the stock and clean the seafood, and we label everything. On the day we arrive two to three hours early, set up the cooking station, light the burners and cook for about an hour; service runs about two hours and breakdown about one, according to Miami Grill Catering's published timeline. Plan at least one team member for every 25 guests; a full-service wedding with a tapas hour takes more. Afterward we clean and oil the pans, close the cylinders and send the final invoice with any add-ons. Write the times down for every event: that log is your best defense if a guest ever complains.</w:t>
       </w:r>
     </w:p>
     <w:p>
@@ -587,7 +587,7 @@
     </w:p>
     <w:p>
       <w:r>
-        <w:t>The team is small and every role has a clear job. The owner is the paella chef, who also sells, buys and cooks at the events that matter most. A lead cook, who doubles as the second paella chef, is a part-time hourly W-2 employee who runs the second pan line and covers the big events. Event staff, meaning servers and buffet attendants, are hourly W-2 employees who work event by event, and a prep cook who doubles as the van driver works part time. There is no dining room, no front-of-house manager and no office, so the payroll flexes with the calendar and the events pay for the structure.</w:t>
+        <w:t>The team is small and every role has a clear job. The owner is the paella chef, who also sells, buys and cooks at the events that matter most. A lead cook, who doubles as the second paella chef, is a part-time hourly W-2 employee who runs the second set of pans and covers the big events. Event staff, meaning servers and buffet attendants, are hourly W-2 employees who work event by event, and a prep cook who doubles as the van driver works part time. There is no dining room, no front-of-house manager and no office, so the payroll flexes with the calendar and the events pay for the structure.</w:t>
       </w:r>
     </w:p>
     <w:p>
@@ -597,7 +597,7 @@
     </w:p>
     <w:p>
       <w:r>
-        <w:t>Every event takes hours of prep, loading, travel, setup, cooking, service and breakdown. The workbook assumes 9.0 hours per person and 2.5 people per event on average, and it compares the hours scheduled with the hours needed to give a coverage of 138%. As a rule of thumb, plan one team member for every 25 guests, according to Miami Grill Catering. One paella chef can run about three pans at once, and a Kit estimate is to add a helper from four pans or about 80 guests. High coverage does not mean you have too many people. It means the roster can carry the busy Saturdays, including a weekend with two weddings. The workbook spreads payroll evenly over the 12 months, which is conservative.</w:t>
+        <w:t>Every event takes hours of prep, loading, travel, setup, cooking, service and breakdown. The workbook assumes 9.0 hours per person and 2.5 people per event on average, and it compares the hours scheduled with the hours needed to give a coverage of 138%. As a rule of thumb, plan one team member for every 25 guests, according to Miami Grill Catering. That is the lean end: a full-service wedding with a tapas hour, like the calculator's example, takes closer to one person per 14 guests. One paella chef can run about three pans at once, and a kit estimate is to add a helper from four pans or about 80 guests. High coverage does not mean you have too many people. It means the roster can carry the busy Saturdays, including a weekend with two weddings. The workbook spreads payroll evenly over the 12 months, which is conservative.</w:t>
       </w:r>
     </w:p>
     <w:p>
@@ -639,12 +639,12 @@
     </w:p>
     <w:p>
       <w:r>
-        <w:t>The investment is built from lines you can price today. The largest are the used cargo van ($18,000) and the paella pans ($1,800), followed by the burners and stands ($2,500), the van upfit ($3,000), the event setup and holding gear ($3,000) and the propane and fire-safety kit ($900). Then come the website, photos and first bridal show ($4,500), first-year permits and certifications ($2,000) and the opening inventory ($2,500). Startup costs also include a 10% contingency on the burners, the pans, the van and its upfit and the fire inspection, and they add up to $49,480. On top we set aside working capital of $39,486, which covers the first months while payments come in, for a total investment of $88,966. It is funded with $25,000 of owner equity and a $64,000 loan at 10.0% over 7 years, with an annual payment of $13,146. A loan of that size means a bank loan or an SBA 7(a) loan, not a Microloan. The plan is lender-ready, but approval is not guaranteed: the terms are an illustration, not an offer, so get quotes for the van and the pans before you treat any figure as closed.</w:t>
+        <w:t>The investment is built from lines you can price today. The largest are the used cargo van ($18,000) and the website, photos and first bridal show ($4,500), followed by the van upfit ($3,000), the event setup and holding gear ($3,000), the opening inventory ($2,500), the burners and stands ($2,500), the paella pans ($1,800) and the propane and fire-safety kit ($900). Then come first-year permits and certifications ($2,000). Startup costs also include a 10% contingency on the burners, the pans, the van and its upfit and the fire inspection, and they add up to $49,480. On top we set aside working capital of $39,486, which covers the first months while payments come in, for a total investment of $88,966. It is funded with $25,000 of owner equity and a $64,000 loan at 10.0% over 7 years, with an annual payment of $13,146. A loan of that size means a bank loan or an SBA 7(a) loan, not a Microloan. The plan is lender-ready, but approval is not guaranteed: the terms are an illustration, not an offer, so get quotes for the van and the pans before you treat any figure as closed.</w:t>
       </w:r>
     </w:p>
     <w:p>
       <w:r>
-        <w:t>Revenue grows with the number of events, not with the price. The workbook raises events by 10% in year 2 and 6% in year 3, from 135 to 148 and then 157, at the same price per guest and the same guests per event. That takes sales from $313,200 in year 1 to $344,520 in year 2 and $365,191 in year 3, and net profit from $20,319 to $32,133 and $39,133. Growth in events is realistic only if repeat business builds: companies that reorder, venues that send you bookings and families that return for the next birthday. The model applies an income tax rate of 25% as a reserve; with a pass-through LLC the owner pays that tax on a personal return, so keeping the reserve is the prudent choice. Capacity matters too, because one crew and one set of pans can only cover so many Saturdays.</w:t>
+        <w:t>Revenue grows with the number of events, not with the price. The workbook raises events by 10% in year 2 and 6% in year 3, from 135 to about 149 and then 157 (the workbook keeps the annual averages with decimals), at the same price per guest and the same guests per event. That takes sales from $313,200 in year 1 to $344,520 in year 2 and $365,191 in year 3, and net profit from $20,319 to $32,133 and $39,133. Growth in events is realistic only if repeat business builds: companies that reorder, venues that send you bookings and families that return for the next birthday. The model applies an income tax rate of 25% as a reserve; with a pass-through LLC the owner pays that tax on a personal return, so keeping the reserve is the prudent choice. Capacity matters too, because one crew and one set of pans can only cover so many Saturdays.</w:t>
       </w:r>
     </w:p>
     <w:p>
@@ -659,7 +659,7 @@
     </w:p>
     <w:p>
       <w:r>
-        <w:t>You can fail on cash even when the profit looks good. The workbook assumes you collect from clients in 7 days on average and pay suppliers in 7 days, with payroll going out every month. The lowest cash balance is $31,627 in Month 2, the lowest debt service coverage is 2.47× and the payback before debt is 2.3 years. A deposit of 25% to 50% is common among U.S. caterers (Kit estimate), and the pricing calculator proposes 50%, but the workbook does not model it, so real cash should be a little better than the workbook shows.</w:t>
+        <w:t>You can fail on cash even when the profit looks good. The workbook assumes you collect from clients in 7 days on average and pay suppliers in 7 days, with payroll going out every month. The lowest cash balance is $31,627 in Month 2, the lowest debt service coverage is 2.47× and the payback before debt is 2.3 years. A deposit of 25% to 50% is common among U.S. caterers (kit estimate), and the pricing calculator proposes 50%, but the workbook does not model it, so real cash should be a little better than the workbook shows.</w:t>
       </w:r>
     </w:p>
     <w:p>
@@ -701,7 +701,7 @@
     </w:p>
     <w:p>
       <w:r>
-        <w:t>Fire rules decide where a burner can run. As an example, Virginia's fire code says cooking tents must stand at least 20 feet (6 m) from other tents and keeps LP-gas containers outside the tent. Your city or county may be stricter or silent, so check with your fire marshal before you sign anything. The rule this plan follows is simple: the cooking station sits outdoors or under its own canopy, well away from the guest tent, with an extinguisher within reach and whatever permit the local fire code asks for. A wood-fire setup is only a bonus, and only where a permit allows it and no burn ban applies; for indoor venues, plan on induction. The contract has a plan B for wind, rain or a fire marshal who says no: move the cooking station, switch to induction or cook in the commissary and serve hot.</w:t>
+        <w:t>Fire rules decide where a burner can run. As an example, Virginia's fire code says cooking tents must stand at least 20 feet (6 m) from other tents and keeps LP-gas containers outside the tent. Your city or county may be stricter or silent, so check with your fire marshal before you sign anything. The rule this plan follows is simple: the cooking station sits outdoors or under its own canopy, well away from the guest tent, with an extinguisher within reach and whatever permit the local fire code asks for. A wood-fire setup is only a bonus, and only where a permit allows it and no burn ban applies; for indoor venues, plan on induction burners with smaller induction-ready pans, rented or bought separately (they are not in the example budget). The contract has a plan B for wind, rain or a fire marshal who says no: move the cooking station, switch to induction with smaller pans or cook in the commissary and serve hot.</w:t>
       </w:r>
     </w:p>
     <w:p>
@@ -716,7 +716,7 @@
     </w:p>
     <w:p>
       <w:r>
-        <w:t>The last link is the road. The van is titled and registered with your state DMV in the business name, and your auto policy has to cover commercial use. Federal rules require a commercial driver's license only at a vehicle rating of 26,001 lb or more, which a cargo van does not reach. Carry the cylinders upright, secured and with ventilation. If you operate in the UK, the rules differ: register your food business with the local council at least 28 days before you start trading, expect a Food Hygiene Rating from 0 to 5 (the FHIS in Scotland), keep a HACCP-based plan, declare the 14 listed allergens, which add mollusks, celery and sulphites to the U.S. nine, charge VAT at 20% on event catering once you are VAT-registered, and agree the gas and the fire plan with the council and the venue.</w:t>
+        <w:t>The last link is the road. The van is titled and registered with your state DMV in the business name, and your auto policy has to cover commercial use. Federal rules require a commercial driver's license only at a vehicle rating of 26,001 lb or more, which a cargo van does not reach. Carry the cylinders upright, secured and with ventilation. If you operate in the UK, the rules differ: register your food business with the local council at least 28 days before you start trading, expect a Food Hygiene Rating from 0 to 5 (the FHIS in Scotland), keep a HACCP-based plan, declare the 14 listed allergens, which, unlike the U.S. nine, include mollusks, celery, mustard, lupin and sulphites, charge VAT at 20% on event catering once you are VAT-registered, and agree the gas and the fire plan with the council and the venue.</w:t>
       </w:r>
     </w:p>
     <w:p>
@@ -743,12 +743,12 @@
     </w:p>
     <w:p>
       <w:r>
-        <w:t>Know the risks before you sign anything. A late cancellation is handled with the deposit and a cancellation schedule in the contract. Wind, rain or an open flame the fire marshal does not allow are handled with a canopy over the cooking station, induction for indoor venues, cooking in the commissary and serving hot, or a new date. Rice out of temperature is the risk that can hurt a guest: it is prevented by holding at 135 °F (57 °C) or above or under a written time as a public health control procedure, by throwing leftovers away and by liability insurance. A jump in seafood prices is handled by reviewing the pricing calculator with your own costs every season. A propane incident is prevented with leak tests, secured cylinders and extinguishers. A shortage of staff on peak Saturdays is handled with a bench of trained part-time hourly W-2 employees. Inspections hold no surprises if your permits, logs and commissary agreement are in order.</w:t>
+        <w:t>Know the risks before you sign anything. A late cancellation is handled with the deposit and a cancellation schedule in the contract. Wind, rain or an open flame the fire marshal does not allow are handled with a canopy over the cooking station, induction with smaller pans for indoor venues (not in the example budget), cooking in the commissary and serving hot, or a new date. Rice out of temperature is the risk that can hurt a guest: it is prevented by holding at 135 °F (57 °C) or above or under a written time as a public health control procedure, by throwing leftovers away and by liability insurance. A jump in seafood prices is handled by reviewing the pricing calculator with your own costs every season. A propane incident is prevented with leak tests, secured cylinders and extinguishers. A shortage of staff on peak Saturdays is handled with a bench of trained part-time hourly W-2 employees. Inspections hold no surprises if your permits, logs and commissary agreement are in order.</w:t>
       </w:r>
     </w:p>
     <w:p>
       <w:r>
-        <w:t>Our strengths come from the show. We sell a short list of things and do them in front of the guests, with a paella chef who explains the sofrito, the stock and the socarrat. Eight menu styles let us fit a wedding, a company or a birthday without reinventing the business, from seafood paella to farm vegetable. Our price includes the paella chef and the staff, which many competitors charge separately. A permitted commissary and written allergen handling give planners and venues the reassurance they look for. Fixed costs stay low because we share the commissary and run one van, so a slow month hurts less. And our best sales argument is not price. It is the memory of a paella cooked in front of you.</w:t>
+        <w:t>Our strengths come from the show. We sell a short list of things and do them in front of the guests, with a paella chef who explains the sofrito, the stock and the socarrat. Eight menu styles let us fit a wedding, a company or a birthday without reinventing the business, from seafood paella to farm vegetable. Our price includes the paella chef and the staff, which some competitors charge separately. A permitted commissary and written allergen handling give planners and venues the reassurance they look for. Fixed costs stay low because we share the commissary and run one van, so a slow month hurts less. And our best sales argument is not price. It is the memory of a paella cooked in front of you.</w:t>
       </w:r>
     </w:p>
     <w:p>

</xml_diff>